<commit_message>
Update DOC-7 to match official memo format; expand learning guide tech sections
DOC-7: Rewrite to follow CDC internal memo (簽) format — simplified
主旨/說明/擬辦 structure matching the official workflow.
Learning guide: Expand tech overview from brief tables into detailed
beginner-friendly subsections with code examples from Forminator.

Co-Authored-By: Claude Opus 4.6 <noreply@anthropic.com>
</commit_message>
<xml_diff>
--- a/public/templates/DOC-7.docx
+++ b/public/templates/DOC-7.docx
@@ -4,7 +4,7 @@
   <w:body>
     <w:p>
       <w:pPr>
-        <w:spacing w:after="200"/>
+        <w:spacing w:after="300"/>
         <w:jc w:val="center"/>
       </w:pPr>
       <w:r>
@@ -20,7 +20,7 @@
     </w:p>
     <w:p>
       <w:pPr>
-        <w:spacing w:after="200"/>
+        <w:spacing w:after="300"/>
       </w:pPr>
       <w:r>
         <w:rPr>
@@ -38,7 +38,7 @@
           <w:sz w:val="24"/>
           <w:szCs w:val="24"/>
         </w:rPr>
-        <w:t xml:space="preserve">擬辦理「{project_title_zh}」研究計畫，簽請核示。</w:t>
+        <w:t xml:space="preserve">{responsible_unit}擬執行{project_year}年度無經費需求署內自行研究計畫一件，簽請鑒核。</w:t>
       </w:r>
     </w:p>
     <w:p>
@@ -58,7 +58,7 @@
     </w:p>
     <w:p>
       <w:pPr>
-        <w:spacing w:after="100"/>
+        <w:spacing w:after="300"/>
         <w:ind w:left="480"/>
       </w:pPr>
       <w:r>
@@ -67,49 +67,7 @@
           <w:sz w:val="24"/>
           <w:szCs w:val="24"/>
         </w:rPr>
-        <w:t xml:space="preserve">一、為瞭解{purpose_brief}，擬利用本署防疫資料庫進行回溯性研究分析。</w:t>
-      </w:r>
-    </w:p>
-    <w:p>
-      <w:pPr>
-        <w:spacing w:after="100"/>
-        <w:ind w:left="480"/>
-      </w:pPr>
-      <w:r>
-        <w:rPr>
-          <w:rFonts w:ascii="標楷體" w:cs="標楷體" w:eastAsia="標楷體" w:hAnsi="標楷體"/>
-          <w:sz w:val="24"/>
-          <w:szCs w:val="24"/>
-        </w:rPr>
-        <w:t xml:space="preserve">二、本案研究期程自{execution_start_roc}至{execution_end_roc}，由{responsible_unit}{pi_name_zh}主持，不需額外經費。</w:t>
-      </w:r>
-    </w:p>
-    <w:p>
-      <w:pPr>
-        <w:spacing w:after="100"/>
-        <w:ind w:left="480"/>
-      </w:pPr>
-      <w:r>
-        <w:rPr>
-          <w:rFonts w:ascii="標楷體" w:cs="標楷體" w:eastAsia="標楷體" w:hAnsi="標楷體"/>
-          <w:sz w:val="24"/>
-          <w:szCs w:val="24"/>
-        </w:rPr>
-        <w:t xml:space="preserve">三、依「衛生福利部疾病管制署研究計畫管理要點」規定，本研究計畫書（如附件一）業經單位主管初審，爰提送研究審查會進行審查。</w:t>
-      </w:r>
-    </w:p>
-    <w:p>
-      <w:pPr>
-        <w:spacing w:after="200"/>
-        <w:ind w:left="480"/>
-      </w:pPr>
-      <w:r>
-        <w:rPr>
-          <w:rFonts w:ascii="標楷體" w:cs="標楷體" w:eastAsia="標楷體" w:hAnsi="標楷體"/>
-          <w:sz w:val="24"/>
-          <w:szCs w:val="24"/>
-        </w:rPr>
-        <w:t xml:space="preserve">四、本案擬同時向本署 IRB 申請倫理審查（免審），相關文件如附件二至四。</w:t>
+        <w:t xml:space="preserve">本研究計畫名稱為「{project_title_zh}」，研究計畫書內容詳如附件。</w:t>
       </w:r>
     </w:p>
     <w:p>
@@ -129,7 +87,6 @@
     </w:p>
     <w:p>
       <w:pPr>
-        <w:spacing w:after="100"/>
         <w:ind w:left="480"/>
       </w:pPr>
       <w:r>
@@ -138,131 +95,7 @@
           <w:sz w:val="24"/>
           <w:szCs w:val="24"/>
         </w:rPr>
-        <w:t xml:space="preserve">一、簽請同意辦理上揭研究計畫。</w:t>
-      </w:r>
-    </w:p>
-    <w:p>
-      <w:pPr>
-        <w:spacing w:after="400"/>
-        <w:ind w:left="480"/>
-      </w:pPr>
-      <w:r>
-        <w:rPr>
-          <w:rFonts w:ascii="標楷體" w:cs="標楷體" w:eastAsia="標楷體" w:hAnsi="標楷體"/>
-          <w:sz w:val="24"/>
-          <w:szCs w:val="24"/>
-        </w:rPr>
-        <w:t xml:space="preserve">二、核可後將續依規定向 IRB 申請倫理審查及向資料庫申請使用資料。</w:t>
-      </w:r>
-    </w:p>
-    <w:p>
-      <w:pPr>
-        <w:spacing w:after="100"/>
-      </w:pPr>
-      <w:r>
-        <w:rPr>
-          <w:rFonts w:ascii="標楷體" w:cs="標楷體" w:eastAsia="標楷體" w:hAnsi="標楷體"/>
-          <w:sz w:val="24"/>
-          <w:szCs w:val="24"/>
-        </w:rPr>
-        <w:t xml:space="preserve">附件：</w:t>
-      </w:r>
-    </w:p>
-    <w:p>
-      <w:pPr>
-        <w:spacing w:after="60"/>
-        <w:ind w:left="480"/>
-      </w:pPr>
-      <w:r>
-        <w:rPr>
-          <w:rFonts w:ascii="標楷體" w:cs="標楷體" w:eastAsia="標楷體" w:hAnsi="標楷體"/>
-          <w:sz w:val="24"/>
-          <w:szCs w:val="24"/>
-        </w:rPr>
-        <w:t xml:space="preserve">一、署內研究計畫書</w:t>
-      </w:r>
-    </w:p>
-    <w:p>
-      <w:pPr>
-        <w:spacing w:after="60"/>
-        <w:ind w:left="480"/>
-      </w:pPr>
-      <w:r>
-        <w:rPr>
-          <w:rFonts w:ascii="標楷體" w:cs="標楷體" w:eastAsia="標楷體" w:hAnsi="標楷體"/>
-          <w:sz w:val="24"/>
-          <w:szCs w:val="24"/>
-        </w:rPr>
-        <w:t xml:space="preserve">二、IRB-004 研究計畫書</w:t>
-      </w:r>
-    </w:p>
-    <w:p>
-      <w:pPr>
-        <w:spacing w:after="60"/>
-        <w:ind w:left="480"/>
-      </w:pPr>
-      <w:r>
-        <w:rPr>
-          <w:rFonts w:ascii="標楷體" w:cs="標楷體" w:eastAsia="標楷體" w:hAnsi="標楷體"/>
-          <w:sz w:val="24"/>
-          <w:szCs w:val="24"/>
-        </w:rPr>
-        <w:t xml:space="preserve">三、IRB-012 免審申請表</w:t>
-      </w:r>
-    </w:p>
-    <w:p>
-      <w:pPr>
-        <w:spacing w:after="400"/>
-        <w:ind w:left="480"/>
-      </w:pPr>
-      <w:r>
-        <w:rPr>
-          <w:rFonts w:ascii="標楷體" w:cs="標楷體" w:eastAsia="標楷體" w:hAnsi="標楷體"/>
-          <w:sz w:val="24"/>
-          <w:szCs w:val="24"/>
-        </w:rPr>
-        <w:t xml:space="preserve">四、IRB-018 保密切結書</w:t>
-      </w:r>
-    </w:p>
-    <w:p>
-      <w:pPr>
-        <w:spacing w:after="200"/>
-        <w:jc w:val="right"/>
-      </w:pPr>
-      <w:r>
-        <w:rPr>
-          <w:rFonts w:ascii="標楷體" w:cs="標楷體" w:eastAsia="標楷體" w:hAnsi="標楷體"/>
-          <w:sz w:val="24"/>
-          <w:szCs w:val="24"/>
-        </w:rPr>
-        <w:t xml:space="preserve">{responsible_unit}</w:t>
-      </w:r>
-    </w:p>
-    <w:p>
-      <w:pPr>
-        <w:spacing w:after="100"/>
-        <w:jc w:val="right"/>
-      </w:pPr>
-      <w:r>
-        <w:rPr>
-          <w:rFonts w:ascii="標楷體" w:cs="標楷體" w:eastAsia="標楷體" w:hAnsi="標楷體"/>
-          <w:sz w:val="24"/>
-          <w:szCs w:val="24"/>
-        </w:rPr>
-        <w:t xml:space="preserve">{pi_name_zh}</w:t>
-      </w:r>
-    </w:p>
-    <w:p>
-      <w:pPr>
-        <w:jc w:val="right"/>
-      </w:pPr>
-      <w:r>
-        <w:rPr>
-          <w:rFonts w:ascii="標楷體" w:cs="標楷體" w:eastAsia="標楷體" w:hAnsi="標楷體"/>
-          <w:sz w:val="24"/>
-          <w:szCs w:val="24"/>
-        </w:rPr>
-        <w:t xml:space="preserve">中華民國{filing_date_roc}</w:t>
+        <w:t xml:space="preserve">奉核後據以辦理相關後續事宜。</w:t>
       </w:r>
     </w:p>
     <w:sectPr>

</xml_diff>

<commit_message>
Remove legacy genDOC1~6 from generate-templates.cjs; document script roles in learning guide
generate-templates.cjs previously contained functions for all 7 docs,
which would overwrite the inject-placeholders versions of DOC-1~6.
Removed those functions so only DOC-7 is generated here. Added detailed
section in learning guide explaining the two scripts and the overwrite pitfall.

Co-Authored-By: Claude Opus 4.6 <noreply@anthropic.com>
</commit_message>
<xml_diff>
--- a/public/templates/DOC-7.docx
+++ b/public/templates/DOC-7.docx
@@ -27,16 +27,16 @@
           <w:rFonts w:ascii="標楷體" w:cs="標楷體" w:eastAsia="標楷體" w:hAnsi="標楷體"/>
           <w:b/>
           <w:bCs/>
-          <w:sz w:val="24"/>
-          <w:szCs w:val="24"/>
+          <w:sz w:val="28"/>
+          <w:szCs w:val="28"/>
         </w:rPr>
         <w:t xml:space="preserve">主旨：</w:t>
       </w:r>
       <w:r>
         <w:rPr>
           <w:rFonts w:ascii="標楷體" w:cs="標楷體" w:eastAsia="標楷體" w:hAnsi="標楷體"/>
-          <w:sz w:val="24"/>
-          <w:szCs w:val="24"/>
+          <w:sz w:val="28"/>
+          <w:szCs w:val="28"/>
         </w:rPr>
         <w:t xml:space="preserve">{responsible_unit}擬執行{project_year}年度無經費需求署內自行研究計畫一件，簽請鑒核。</w:t>
       </w:r>
@@ -50,8 +50,8 @@
           <w:rFonts w:ascii="標楷體" w:cs="標楷體" w:eastAsia="標楷體" w:hAnsi="標楷體"/>
           <w:b/>
           <w:bCs/>
-          <w:sz w:val="24"/>
-          <w:szCs w:val="24"/>
+          <w:sz w:val="28"/>
+          <w:szCs w:val="28"/>
         </w:rPr>
         <w:t xml:space="preserve">說明：</w:t>
       </w:r>
@@ -64,8 +64,8 @@
       <w:r>
         <w:rPr>
           <w:rFonts w:ascii="標楷體" w:cs="標楷體" w:eastAsia="標楷體" w:hAnsi="標楷體"/>
-          <w:sz w:val="24"/>
-          <w:szCs w:val="24"/>
+          <w:sz w:val="28"/>
+          <w:szCs w:val="28"/>
         </w:rPr>
         <w:t xml:space="preserve">本研究計畫名稱為「{project_title_zh}」，研究計畫書內容詳如附件。</w:t>
       </w:r>
@@ -79,8 +79,8 @@
           <w:rFonts w:ascii="標楷體" w:cs="標楷體" w:eastAsia="標楷體" w:hAnsi="標楷體"/>
           <w:b/>
           <w:bCs/>
-          <w:sz w:val="24"/>
-          <w:szCs w:val="24"/>
+          <w:sz w:val="28"/>
+          <w:szCs w:val="28"/>
         </w:rPr>
         <w:t xml:space="preserve">擬辦：</w:t>
       </w:r>
@@ -92,8 +92,8 @@
       <w:r>
         <w:rPr>
           <w:rFonts w:ascii="標楷體" w:cs="標楷體" w:eastAsia="標楷體" w:hAnsi="標楷體"/>
-          <w:sz w:val="24"/>
-          <w:szCs w:val="24"/>
+          <w:sz w:val="28"/>
+          <w:szCs w:val="28"/>
         </w:rPr>
         <w:t xml:space="preserve">奉核後據以辦理相關後續事宜。</w:t>
       </w:r>

</xml_diff>

<commit_message>
Release v1.0.0: UI polish, DOC-7 with instructions, feedback button
- Rename to 研究計畫表單終結者, 本系統→本工具
- Add info alert: 目前僅支援署內無經費研究之免審申請
- DOC-7: add page 2 with 公文系統操作說明 (steps 1-11)
- Add floating feedback button with embedded Google Form
- Bump version 0.7 → 1.0.0

Co-Authored-By: Claude Opus 4.6 <noreply@anthropic.com>
</commit_message>
<xml_diff>
--- a/public/templates/DOC-7.docx
+++ b/public/templates/DOC-7.docx
@@ -96,6 +96,308 @@
           <w:szCs w:val="28"/>
         </w:rPr>
         <w:t xml:space="preserve">奉核後據以辦理相關後續事宜。</w:t>
+      </w:r>
+    </w:p>
+    <w:p>
+      <w:pPr>
+        <w:sectPr>
+          <w:pgSz w:w="11906" w:h="16838" w:orient="portrait"/>
+          <w:pgMar w:top="1440" w:right="1440" w:bottom="1440" w:left="1440" w:header="708" w:footer="708" w:gutter="0"/>
+          <w:pgNumType/>
+          <w:docGrid w:linePitch="360"/>
+        </w:sectPr>
+      </w:pPr>
+    </w:p>
+    <w:p>
+      <w:pPr>
+        <w:spacing w:after="400"/>
+        <w:jc w:val="center"/>
+      </w:pPr>
+      <w:r>
+        <w:rPr>
+          <w:rFonts w:ascii="標楷體" w:cs="標楷體" w:eastAsia="標楷體" w:hAnsi="標楷體"/>
+          <w:b/>
+          <w:bCs/>
+          <w:sz w:val="36"/>
+          <w:szCs w:val="36"/>
+        </w:rPr>
+        <w:t xml:space="preserve">公文系統操作說明</w:t>
+      </w:r>
+    </w:p>
+    <w:p>
+      <w:pPr>
+        <w:spacing w:after="200"/>
+      </w:pPr>
+      <w:r>
+        <w:rPr>
+          <w:rFonts w:ascii="標楷體" w:cs="標楷體" w:eastAsia="標楷體" w:hAnsi="標楷體"/>
+          <w:b/>
+          <w:bCs/>
+          <w:sz w:val="28"/>
+          <w:szCs w:val="28"/>
+        </w:rPr>
+        <w:t xml:space="preserve">步驟 1</w:t>
+      </w:r>
+      <w:r>
+        <w:rPr>
+          <w:rFonts w:ascii="標楷體" w:cs="標楷體" w:eastAsia="標楷體" w:hAnsi="標楷體"/>
+          <w:sz w:val="28"/>
+          <w:szCs w:val="28"/>
+        </w:rPr>
+        <w:t xml:space="preserve">　進入公文系統，點選「公文夾」。</w:t>
+      </w:r>
+    </w:p>
+    <w:p>
+      <w:pPr>
+        <w:spacing w:after="200"/>
+      </w:pPr>
+      <w:r>
+        <w:rPr>
+          <w:rFonts w:ascii="標楷體" w:cs="標楷體" w:eastAsia="標楷體" w:hAnsi="標楷體"/>
+          <w:b/>
+          <w:bCs/>
+          <w:sz w:val="28"/>
+          <w:szCs w:val="28"/>
+        </w:rPr>
+        <w:t xml:space="preserve">步驟 2</w:t>
+      </w:r>
+      <w:r>
+        <w:rPr>
+          <w:rFonts w:ascii="標楷體" w:cs="標楷體" w:eastAsia="標楷體" w:hAnsi="標楷體"/>
+          <w:sz w:val="28"/>
+          <w:szCs w:val="28"/>
+        </w:rPr>
+        <w:t xml:space="preserve">　在右方點擊「←」兩次，直到看見「創稿」選項。</w:t>
+      </w:r>
+    </w:p>
+    <w:p>
+      <w:pPr>
+        <w:spacing w:after="200"/>
+      </w:pPr>
+      <w:r>
+        <w:rPr>
+          <w:rFonts w:ascii="標楷體" w:cs="標楷體" w:eastAsia="標楷體" w:hAnsi="標楷體"/>
+          <w:b/>
+          <w:bCs/>
+          <w:sz w:val="28"/>
+          <w:szCs w:val="28"/>
+        </w:rPr>
+        <w:t xml:space="preserve">步驟 3</w:t>
+      </w:r>
+      <w:r>
+        <w:rPr>
+          <w:rFonts w:ascii="標楷體" w:cs="標楷體" w:eastAsia="標楷體" w:hAnsi="標楷體"/>
+          <w:sz w:val="28"/>
+          <w:szCs w:val="28"/>
+        </w:rPr>
+        <w:t xml:space="preserve">　點選「簽（稿）」。</w:t>
+      </w:r>
+    </w:p>
+    <w:p>
+      <w:pPr>
+        <w:spacing w:after="200"/>
+      </w:pPr>
+      <w:r>
+        <w:rPr>
+          <w:rFonts w:ascii="標楷體" w:cs="標楷體" w:eastAsia="標楷體" w:hAnsi="標楷體"/>
+          <w:b/>
+          <w:bCs/>
+          <w:sz w:val="28"/>
+          <w:szCs w:val="28"/>
+        </w:rPr>
+        <w:t xml:space="preserve">步驟 4</w:t>
+      </w:r>
+      <w:r>
+        <w:rPr>
+          <w:rFonts w:ascii="標楷體" w:cs="標楷體" w:eastAsia="標楷體" w:hAnsi="標楷體"/>
+          <w:sz w:val="28"/>
+          <w:szCs w:val="28"/>
+        </w:rPr>
+        <w:t xml:space="preserve">　點選左方「尚未取號」的位置，再點選「創稿號」以取得公文號。</w:t>
+      </w:r>
+    </w:p>
+    <w:p>
+      <w:pPr>
+        <w:spacing w:after="200"/>
+      </w:pPr>
+      <w:r>
+        <w:rPr>
+          <w:rFonts w:ascii="標楷體" w:cs="標楷體" w:eastAsia="標楷體" w:hAnsi="標楷體"/>
+          <w:b/>
+          <w:bCs/>
+          <w:sz w:val="28"/>
+          <w:szCs w:val="28"/>
+        </w:rPr>
+        <w:t xml:space="preserve">步驟 5</w:t>
+      </w:r>
+      <w:r>
+        <w:rPr>
+          <w:rFonts w:ascii="標楷體" w:cs="標楷體" w:eastAsia="標楷體" w:hAnsi="標楷體"/>
+          <w:sz w:val="28"/>
+          <w:szCs w:val="28"/>
+        </w:rPr>
+        <w:t xml:space="preserve">　選取檔號，系統會跳出查詢視窗，依序選擇「組室」及「業務」後，選擇「其他」。</w:t>
+      </w:r>
+    </w:p>
+    <w:p>
+      <w:pPr>
+        <w:spacing w:after="200"/>
+      </w:pPr>
+      <w:r>
+        <w:rPr>
+          <w:rFonts w:ascii="標楷體" w:cs="標楷體" w:eastAsia="標楷體" w:hAnsi="標楷體"/>
+          <w:b/>
+          <w:bCs/>
+          <w:sz w:val="28"/>
+          <w:szCs w:val="28"/>
+        </w:rPr>
+        <w:t xml:space="preserve">步驟 6</w:t>
+      </w:r>
+      <w:r>
+        <w:rPr>
+          <w:rFonts w:ascii="標楷體" w:cs="標楷體" w:eastAsia="標楷體" w:hAnsi="標楷體"/>
+          <w:sz w:val="28"/>
+          <w:szCs w:val="28"/>
+        </w:rPr>
+        <w:t xml:space="preserve">　記得填寫日期。</w:t>
+      </w:r>
+    </w:p>
+    <w:p>
+      <w:pPr>
+        <w:spacing w:after="200"/>
+      </w:pPr>
+      <w:r>
+        <w:rPr>
+          <w:rFonts w:ascii="標楷體" w:cs="標楷體" w:eastAsia="標楷體" w:hAnsi="標楷體"/>
+          <w:b/>
+          <w:bCs/>
+          <w:sz w:val="28"/>
+          <w:szCs w:val="28"/>
+        </w:rPr>
+        <w:t xml:space="preserve">步驟 7</w:t>
+      </w:r>
+      <w:r>
+        <w:rPr>
+          <w:rFonts w:ascii="標楷體" w:cs="標楷體" w:eastAsia="標楷體" w:hAnsi="標楷體"/>
+          <w:sz w:val="28"/>
+          <w:szCs w:val="28"/>
+        </w:rPr>
+        <w:t xml:space="preserve">　將第一頁的簽呈內容（主旨、說明、擬辦）填入公文系統對應欄位。</w:t>
+      </w:r>
+    </w:p>
+    <w:p>
+      <w:pPr>
+        <w:spacing w:after="200"/>
+      </w:pPr>
+      <w:r>
+        <w:rPr>
+          <w:rFonts w:ascii="標楷體" w:cs="標楷體" w:eastAsia="標楷體" w:hAnsi="標楷體"/>
+          <w:b/>
+          <w:bCs/>
+          <w:sz w:val="28"/>
+          <w:szCs w:val="28"/>
+        </w:rPr>
+        <w:t xml:space="preserve">步驟 8</w:t>
+      </w:r>
+      <w:r>
+        <w:rPr>
+          <w:rFonts w:ascii="標楷體" w:cs="標楷體" w:eastAsia="標楷體" w:hAnsi="標楷體"/>
+          <w:sz w:val="28"/>
+          <w:szCs w:val="28"/>
+        </w:rPr>
+        <w:t xml:space="preserve">　點選附件管理 → 新增 → 將研究計畫書上傳（即 DOC-4 署內研究計畫書）。</w:t>
+      </w:r>
+    </w:p>
+    <w:p>
+      <w:pPr>
+        <w:spacing w:after="200"/>
+      </w:pPr>
+      <w:r>
+        <w:rPr>
+          <w:rFonts w:ascii="標楷體" w:cs="標楷體" w:eastAsia="標楷體" w:hAnsi="標楷體"/>
+          <w:b/>
+          <w:bCs/>
+          <w:sz w:val="28"/>
+          <w:szCs w:val="28"/>
+        </w:rPr>
+        <w:t xml:space="preserve">步驟 9</w:t>
+      </w:r>
+      <w:r>
+        <w:rPr>
+          <w:rFonts w:ascii="標楷體" w:cs="標楷體" w:eastAsia="標楷體" w:hAnsi="標楷體"/>
+          <w:sz w:val="28"/>
+          <w:szCs w:val="28"/>
+        </w:rPr>
+        <w:t xml:space="preserve">　設定會辦單位。</w:t>
+      </w:r>
+    </w:p>
+    <w:p>
+      <w:pPr>
+        <w:spacing w:after="200"/>
+      </w:pPr>
+      <w:r>
+        <w:rPr>
+          <w:rFonts w:ascii="標楷體" w:cs="標楷體" w:eastAsia="標楷體" w:hAnsi="標楷體"/>
+          <w:b/>
+          <w:bCs/>
+          <w:sz w:val="28"/>
+          <w:szCs w:val="28"/>
+        </w:rPr>
+        <w:t xml:space="preserve">步驟 10</w:t>
+      </w:r>
+      <w:r>
+        <w:rPr>
+          <w:rFonts w:ascii="標楷體" w:cs="標楷體" w:eastAsia="標楷體" w:hAnsi="標楷體"/>
+          <w:sz w:val="28"/>
+          <w:szCs w:val="28"/>
+        </w:rPr>
+        <w:t xml:space="preserve">　點選「設定」，檢查預排流程是否正確。</w:t>
+      </w:r>
+    </w:p>
+    <w:p>
+      <w:pPr>
+        <w:spacing w:after="400"/>
+      </w:pPr>
+      <w:r>
+        <w:rPr>
+          <w:rFonts w:ascii="標楷體" w:cs="標楷體" w:eastAsia="標楷體" w:hAnsi="標楷體"/>
+          <w:b/>
+          <w:bCs/>
+          <w:sz w:val="28"/>
+          <w:szCs w:val="28"/>
+        </w:rPr>
+        <w:t xml:space="preserve">步驟 11</w:t>
+      </w:r>
+      <w:r>
+        <w:rPr>
+          <w:rFonts w:ascii="標楷體" w:cs="標楷體" w:eastAsia="標楷體" w:hAnsi="標楷體"/>
+          <w:sz w:val="28"/>
+          <w:szCs w:val="28"/>
+        </w:rPr>
+        <w:t xml:space="preserve">　蓋章、儲存，確認無誤後送出。</w:t>
+      </w:r>
+    </w:p>
+    <w:p>
+      <w:pPr>
+        <w:spacing w:after="100"/>
+      </w:pPr>
+      <w:r>
+        <w:rPr>
+          <w:rFonts w:ascii="標楷體" w:cs="標楷體" w:eastAsia="標楷體" w:hAnsi="標楷體"/>
+          <w:b/>
+          <w:bCs/>
+          <w:sz w:val="28"/>
+          <w:szCs w:val="28"/>
+        </w:rPr>
+        <w:t xml:space="preserve">※ 提醒：</w:t>
+      </w:r>
+      <w:r>
+        <w:rPr>
+          <w:rFonts w:ascii="標楷體" w:cs="標楷體" w:eastAsia="標楷體" w:hAnsi="標楷體"/>
+          <w:sz w:val="28"/>
+          <w:szCs w:val="28"/>
+        </w:rPr>
+        <w:t xml:space="preserve">公文主旨、說明、擬辦的內容已在第一頁自動帶入，請直接複製貼上即可。</w:t>
       </w:r>
     </w:p>
     <w:sectPr>

</xml_diff>